<commit_message>
Sampul qism: judul asli berhuruf PT Bold Heading, sub-judul dalam kurung
«عنوان البحث» di model adalah tempat judul, bukan label: diganti @judul (sebelum
« - ") berhuruf PT Bold Heading 24; «( … )» = sub-judul. Huruf tidak ikut repo:
belum terpasang = PERINGATAN dan Traditional Arabic tebal. Ukuran dan jarak
disamakan dengan model (selisih < 7 pt); gambar tanpa metadata C2PA ChatGPT;
judul ekstrem yang tetap dua halaman = PERINGATAN; @tahun 1300-1499; @sampul
salah ketik tidak menambah galat data wajib.

Co-Authored-By: Claude Opus 5.5 <noreply@anthropic.com>
</commit_message>
<xml_diff>
--- a/mesin/sampul_qism.docx
+++ b/mesin/sampul_qism.docx
@@ -30,6 +30,7 @@
           </w:tcPr>
           <w:p>
             <w:pPr>
+              <w:spacing w:before="560"/>
               <w:rPr>
                 <w:rtl/>
               </w:rPr>
@@ -41,16 +42,16 @@
                 <w:lang w:val="ar-SA"/>
               </w:rPr>
               <w:drawing>
-                <wp:inline distT="0" distB="0" distL="0" distR="0" wp14:anchorId="4DAFC097" wp14:editId="04AEBC4E">
+                <wp:inline distT="0" distB="0" distL="0" distR="0" wp14:anchorId="1838ABDC" wp14:editId="7CA5BB59">
                   <wp:extent cx="2006600" cy="810761"/>
                   <wp:effectExtent l="0" t="0" r="0" b="8890"/>
-                  <wp:docPr id="1382121118" name="Picture 1"/>
+                  <wp:docPr id="1363727091" name="Picture 1"/>
                   <wp:cNvGraphicFramePr/>
                   <a:graphic xmlns:a="http://schemas.openxmlformats.org/drawingml/2006/main">
                     <a:graphicData uri="http://schemas.openxmlformats.org/drawingml/2006/picture">
                       <pic:pic xmlns:pic="http://schemas.openxmlformats.org/drawingml/2006/picture">
                         <pic:nvPicPr>
-                          <pic:cNvPr id="1382121118" name=""/>
+                          <pic:cNvPr id="1363727091" name=""/>
                           <pic:cNvPicPr/>
                         </pic:nvPicPr>
                         <pic:blipFill>
@@ -85,15 +86,15 @@
             <w:pPr>
               <w:spacing w:before="40"/>
               <w:rPr>
-                <w:sz w:val="26"/>
-                <w:szCs w:val="26"/>
+                <w:sz w:val="30"/>
+                <w:szCs w:val="30"/>
                 <w:rtl/>
               </w:rPr>
             </w:pPr>
             <w:r>
               <w:rPr>
-                <w:sz w:val="26"/>
-                <w:szCs w:val="26"/>
+                <w:sz w:val="30"/>
+                <w:szCs w:val="30"/>
                 <w:rtl/>
               </w:rPr>
               <w:t>قسم الشريعة</w:t>
@@ -119,16 +120,16 @@
                 <w:lang w:val="ar-SA"/>
               </w:rPr>
               <w:drawing>
-                <wp:inline distT="0" distB="0" distL="0" distR="0" wp14:anchorId="7F168EDE" wp14:editId="581DA779">
+                <wp:inline distT="0" distB="0" distL="0" distR="0" wp14:anchorId="0B389C4F" wp14:editId="70656377">
                   <wp:extent cx="1050375" cy="1498600"/>
                   <wp:effectExtent l="0" t="0" r="0" b="6350"/>
-                  <wp:docPr id="1866924330" name="Picture 2"/>
+                  <wp:docPr id="1103116512" name="Picture 2"/>
                   <wp:cNvGraphicFramePr/>
                   <a:graphic xmlns:a="http://schemas.openxmlformats.org/drawingml/2006/main">
                     <a:graphicData uri="http://schemas.openxmlformats.org/drawingml/2006/picture">
                       <pic:pic xmlns:pic="http://schemas.openxmlformats.org/drawingml/2006/picture">
                         <pic:nvPicPr>
-                          <pic:cNvPr id="1866924330" name=""/>
+                          <pic:cNvPr id="1103116512" name=""/>
                           <pic:cNvPicPr/>
                         </pic:nvPicPr>
                         <pic:blipFill>
@@ -166,52 +167,20 @@
       <w:pPr>
         <w:spacing w:before="920"/>
         <w:rPr>
+          <w:rFonts w:ascii="PT Bold Heading" w:hAnsi="PT Bold Heading" w:cs="PT Bold Heading"/>
+          <w:sz w:val="48"/>
+          <w:szCs w:val="48"/>
           <w:rtl/>
         </w:rPr>
       </w:pPr>
       <w:r>
         <w:rPr>
-          <w:noProof/>
-        </w:rPr>
-        <w:drawing>
-          <wp:inline distT="0" distB="0" distL="0" distR="0" wp14:anchorId="5F37DD75" wp14:editId="18DC57B6">
-            <wp:extent cx="1460500" cy="295788"/>
-            <wp:effectExtent l="0" t="0" r="6350" b="9525"/>
-            <wp:docPr id="1345914110" name="Picture 3"/>
-            <wp:cNvGraphicFramePr/>
-            <a:graphic xmlns:a="http://schemas.openxmlformats.org/drawingml/2006/main">
-              <a:graphicData uri="http://schemas.openxmlformats.org/drawingml/2006/picture">
-                <pic:pic xmlns:pic="http://schemas.openxmlformats.org/drawingml/2006/picture">
-                  <pic:nvPicPr>
-                    <pic:cNvPr id="1345914110" name=""/>
-                    <pic:cNvPicPr/>
-                  </pic:nvPicPr>
-                  <pic:blipFill>
-                    <a:blip r:embed="rId6" cstate="print">
-                      <a:extLst>
-                        <a:ext uri="{28A0092B-C50C-407E-A947-70E740481C1C}">
-                          <a14:useLocalDpi xmlns:a14="http://schemas.microsoft.com/office/drawing/2010/main" val="0"/>
-                        </a:ext>
-                      </a:extLst>
-                    </a:blip>
-                    <a:stretch>
-                      <a:fillRect/>
-                    </a:stretch>
-                  </pic:blipFill>
-                  <pic:spPr>
-                    <a:xfrm>
-                      <a:off x="0" y="0"/>
-                      <a:ext cx="1460500" cy="295788"/>
-                    </a:xfrm>
-                    <a:prstGeom prst="rect">
-                      <a:avLst/>
-                    </a:prstGeom>
-                  </pic:spPr>
-                </pic:pic>
-              </a:graphicData>
-            </a:graphic>
-          </wp:inline>
-        </w:drawing>
+          <w:rFonts w:ascii="PT Bold Heading" w:hAnsi="PT Bold Heading" w:cs="PT Bold Heading"/>
+          <w:sz w:val="48"/>
+          <w:szCs w:val="48"/>
+          <w:rtl/>
+        </w:rPr>
+        <w:t>عنوان البحث</w:t>
       </w:r>
     </w:p>
     <w:p>
@@ -238,12 +207,12 @@
     </w:p>
     <w:p>
       <w:pPr>
-        <w:spacing w:before="1240"/>
+        <w:spacing w:before="1080" w:line="540" w:lineRule="exact"/>
         <w:rPr>
           <w:b/>
           <w:bCs/>
-          <w:sz w:val="40"/>
-          <w:szCs w:val="40"/>
+          <w:sz w:val="42"/>
+          <w:szCs w:val="42"/>
           <w:rtl/>
         </w:rPr>
       </w:pPr>
@@ -251,8 +220,8 @@
         <w:rPr>
           <w:b/>
           <w:bCs/>
-          <w:sz w:val="40"/>
-          <w:szCs w:val="40"/>
+          <w:sz w:val="42"/>
+          <w:szCs w:val="42"/>
           <w:rtl/>
         </w:rPr>
         <w:t>المشرف</w:t>
@@ -260,12 +229,12 @@
     </w:p>
     <w:p>
       <w:pPr>
-        <w:spacing w:before="40"/>
+        <w:spacing w:line="540" w:lineRule="exact"/>
         <w:rPr>
           <w:b/>
           <w:bCs/>
-          <w:sz w:val="40"/>
-          <w:szCs w:val="40"/>
+          <w:sz w:val="42"/>
+          <w:szCs w:val="42"/>
           <w:rtl/>
         </w:rPr>
       </w:pPr>
@@ -273,8 +242,8 @@
         <w:rPr>
           <w:b/>
           <w:bCs/>
-          <w:sz w:val="40"/>
-          <w:szCs w:val="40"/>
+          <w:sz w:val="42"/>
+          <w:szCs w:val="42"/>
           <w:rtl/>
         </w:rPr>
         <w:t>اسم المشرف</w:t>
@@ -282,16 +251,17 @@
     </w:p>
     <w:p>
       <w:pPr>
-        <w:rPr>
-          <w:sz w:val="36"/>
-          <w:szCs w:val="36"/>
+        <w:spacing w:line="540" w:lineRule="exact"/>
+        <w:rPr>
+          <w:sz w:val="42"/>
+          <w:szCs w:val="42"/>
           <w:rtl/>
         </w:rPr>
       </w:pPr>
       <w:r>
         <w:rPr>
-          <w:sz w:val="36"/>
-          <w:szCs w:val="36"/>
+          <w:sz w:val="42"/>
+          <w:szCs w:val="42"/>
           <w:rtl/>
         </w:rPr>
         <w:t>الدرجة العلمية للمشرف</w:t>
@@ -299,12 +269,12 @@
     </w:p>
     <w:p>
       <w:pPr>
-        <w:spacing w:before="920"/>
+        <w:spacing w:before="960" w:line="540" w:lineRule="exact"/>
         <w:rPr>
           <w:b/>
           <w:bCs/>
-          <w:sz w:val="40"/>
-          <w:szCs w:val="40"/>
+          <w:sz w:val="42"/>
+          <w:szCs w:val="42"/>
           <w:rtl/>
         </w:rPr>
       </w:pPr>
@@ -312,8 +282,8 @@
         <w:rPr>
           <w:b/>
           <w:bCs/>
-          <w:sz w:val="40"/>
-          <w:szCs w:val="40"/>
+          <w:sz w:val="42"/>
+          <w:szCs w:val="42"/>
           <w:rtl/>
         </w:rPr>
         <w:t>إعداد الطالب:</w:t>
@@ -321,11 +291,12 @@
     </w:p>
     <w:p>
       <w:pPr>
+        <w:spacing w:line="540" w:lineRule="exact"/>
         <w:rPr>
           <w:b/>
           <w:bCs/>
-          <w:sz w:val="40"/>
-          <w:szCs w:val="40"/>
+          <w:sz w:val="42"/>
+          <w:szCs w:val="42"/>
           <w:rtl/>
         </w:rPr>
       </w:pPr>
@@ -333,8 +304,8 @@
         <w:rPr>
           <w:b/>
           <w:bCs/>
-          <w:sz w:val="40"/>
-          <w:szCs w:val="40"/>
+          <w:sz w:val="42"/>
+          <w:szCs w:val="42"/>
           <w:rtl/>
         </w:rPr>
         <w:t>اسم الطالب</w:t>
@@ -342,7 +313,7 @@
     </w:p>
     <w:p>
       <w:pPr>
-        <w:spacing w:before="1700"/>
+        <w:spacing w:before="1820" w:line="540" w:lineRule="exact"/>
         <w:rPr>
           <w:sz w:val="36"/>
           <w:szCs w:val="36"/>
@@ -360,6 +331,7 @@
     </w:p>
     <w:p>
       <w:pPr>
+        <w:spacing w:line="540" w:lineRule="exact"/>
         <w:rPr>
           <w:sz w:val="36"/>
           <w:szCs w:val="36"/>
@@ -803,7 +775,7 @@
     <w:link w:val="Heading1Char"/>
     <w:uiPriority w:val="9"/>
     <w:qFormat/>
-    <w:rsid w:val="001C4CC1"/>
+    <w:rsid w:val="00C9137F"/>
     <w:pPr>
       <w:keepNext/>
       <w:keepLines/>
@@ -826,7 +798,7 @@
     <w:semiHidden/>
     <w:unhideWhenUsed/>
     <w:qFormat/>
-    <w:rsid w:val="001C4CC1"/>
+    <w:rsid w:val="00C9137F"/>
     <w:pPr>
       <w:keepNext/>
       <w:keepLines/>
@@ -847,7 +819,7 @@
     <w:semiHidden/>
     <w:unhideWhenUsed/>
     <w:qFormat/>
-    <w:rsid w:val="001C4CC1"/>
+    <w:rsid w:val="00C9137F"/>
     <w:pPr>
       <w:keepNext/>
       <w:keepLines/>
@@ -870,7 +842,7 @@
     <w:semiHidden/>
     <w:unhideWhenUsed/>
     <w:qFormat/>
-    <w:rsid w:val="001C4CC1"/>
+    <w:rsid w:val="00C9137F"/>
     <w:pPr>
       <w:keepNext/>
       <w:keepLines/>
@@ -893,7 +865,7 @@
     <w:semiHidden/>
     <w:unhideWhenUsed/>
     <w:qFormat/>
-    <w:rsid w:val="001C4CC1"/>
+    <w:rsid w:val="00C9137F"/>
     <w:pPr>
       <w:keepNext/>
       <w:keepLines/>
@@ -914,7 +886,7 @@
     <w:semiHidden/>
     <w:unhideWhenUsed/>
     <w:qFormat/>
-    <w:rsid w:val="001C4CC1"/>
+    <w:rsid w:val="00C9137F"/>
     <w:pPr>
       <w:keepNext/>
       <w:keepLines/>
@@ -937,7 +909,7 @@
     <w:semiHidden/>
     <w:unhideWhenUsed/>
     <w:qFormat/>
-    <w:rsid w:val="001C4CC1"/>
+    <w:rsid w:val="00C9137F"/>
     <w:pPr>
       <w:keepNext/>
       <w:keepLines/>
@@ -958,7 +930,7 @@
     <w:semiHidden/>
     <w:unhideWhenUsed/>
     <w:qFormat/>
-    <w:rsid w:val="001C4CC1"/>
+    <w:rsid w:val="00C9137F"/>
     <w:pPr>
       <w:keepNext/>
       <w:keepLines/>
@@ -980,7 +952,7 @@
     <w:semiHidden/>
     <w:unhideWhenUsed/>
     <w:qFormat/>
-    <w:rsid w:val="001C4CC1"/>
+    <w:rsid w:val="00C9137F"/>
     <w:pPr>
       <w:keepNext/>
       <w:keepLines/>
@@ -1023,7 +995,7 @@
     <w:basedOn w:val="DefaultParagraphFont"/>
     <w:link w:val="Heading1"/>
     <w:uiPriority w:val="9"/>
-    <w:rsid w:val="001C4CC1"/>
+    <w:rsid w:val="00C9137F"/>
     <w:rPr>
       <w:rFonts w:asciiTheme="majorHAnsi" w:eastAsiaTheme="majorEastAsia" w:hAnsiTheme="majorHAnsi" w:cstheme="majorBidi"/>
       <w:color w:val="0F4761" w:themeColor="accent1" w:themeShade="BF"/>
@@ -1037,7 +1009,7 @@
     <w:link w:val="Heading2"/>
     <w:uiPriority w:val="9"/>
     <w:semiHidden/>
-    <w:rsid w:val="001C4CC1"/>
+    <w:rsid w:val="00C9137F"/>
     <w:rPr>
       <w:rFonts w:asciiTheme="majorHAnsi" w:eastAsiaTheme="majorEastAsia" w:hAnsiTheme="majorHAnsi" w:cstheme="majorBidi"/>
       <w:color w:val="0F4761" w:themeColor="accent1" w:themeShade="BF"/>
@@ -1051,7 +1023,7 @@
     <w:link w:val="Heading3"/>
     <w:uiPriority w:val="9"/>
     <w:semiHidden/>
-    <w:rsid w:val="001C4CC1"/>
+    <w:rsid w:val="00C9137F"/>
     <w:rPr>
       <w:rFonts w:eastAsiaTheme="majorEastAsia" w:cstheme="majorBidi"/>
       <w:color w:val="0F4761" w:themeColor="accent1" w:themeShade="BF"/>
@@ -1065,7 +1037,7 @@
     <w:link w:val="Heading4"/>
     <w:uiPriority w:val="9"/>
     <w:semiHidden/>
-    <w:rsid w:val="001C4CC1"/>
+    <w:rsid w:val="00C9137F"/>
     <w:rPr>
       <w:rFonts w:eastAsiaTheme="majorEastAsia" w:cstheme="majorBidi"/>
       <w:i/>
@@ -1079,7 +1051,7 @@
     <w:link w:val="Heading5"/>
     <w:uiPriority w:val="9"/>
     <w:semiHidden/>
-    <w:rsid w:val="001C4CC1"/>
+    <w:rsid w:val="00C9137F"/>
     <w:rPr>
       <w:rFonts w:eastAsiaTheme="majorEastAsia" w:cstheme="majorBidi"/>
       <w:color w:val="0F4761" w:themeColor="accent1" w:themeShade="BF"/>
@@ -1091,7 +1063,7 @@
     <w:link w:val="Heading6"/>
     <w:uiPriority w:val="9"/>
     <w:semiHidden/>
-    <w:rsid w:val="001C4CC1"/>
+    <w:rsid w:val="00C9137F"/>
     <w:rPr>
       <w:rFonts w:eastAsiaTheme="majorEastAsia" w:cstheme="majorBidi"/>
       <w:i/>
@@ -1105,7 +1077,7 @@
     <w:link w:val="Heading7"/>
     <w:uiPriority w:val="9"/>
     <w:semiHidden/>
-    <w:rsid w:val="001C4CC1"/>
+    <w:rsid w:val="00C9137F"/>
     <w:rPr>
       <w:rFonts w:eastAsiaTheme="majorEastAsia" w:cstheme="majorBidi"/>
       <w:color w:val="595959" w:themeColor="text1" w:themeTint="A6"/>
@@ -1117,7 +1089,7 @@
     <w:link w:val="Heading8"/>
     <w:uiPriority w:val="9"/>
     <w:semiHidden/>
-    <w:rsid w:val="001C4CC1"/>
+    <w:rsid w:val="00C9137F"/>
     <w:rPr>
       <w:rFonts w:eastAsiaTheme="majorEastAsia" w:cstheme="majorBidi"/>
       <w:i/>
@@ -1131,7 +1103,7 @@
     <w:link w:val="Heading9"/>
     <w:uiPriority w:val="9"/>
     <w:semiHidden/>
-    <w:rsid w:val="001C4CC1"/>
+    <w:rsid w:val="00C9137F"/>
     <w:rPr>
       <w:rFonts w:eastAsiaTheme="majorEastAsia" w:cstheme="majorBidi"/>
       <w:color w:val="272727" w:themeColor="text1" w:themeTint="D8"/>
@@ -1144,7 +1116,7 @@
     <w:link w:val="TitleChar"/>
     <w:uiPriority w:val="10"/>
     <w:qFormat/>
-    <w:rsid w:val="001C4CC1"/>
+    <w:rsid w:val="00C9137F"/>
     <w:pPr>
       <w:spacing w:after="80"/>
       <w:contextualSpacing/>
@@ -1162,7 +1134,7 @@
     <w:basedOn w:val="DefaultParagraphFont"/>
     <w:link w:val="Title"/>
     <w:uiPriority w:val="10"/>
-    <w:rsid w:val="001C4CC1"/>
+    <w:rsid w:val="00C9137F"/>
     <w:rPr>
       <w:rFonts w:asciiTheme="majorHAnsi" w:eastAsiaTheme="majorEastAsia" w:hAnsiTheme="majorHAnsi" w:cstheme="majorBidi"/>
       <w:spacing w:val="-10"/>
@@ -1178,7 +1150,7 @@
     <w:link w:val="SubtitleChar"/>
     <w:uiPriority w:val="11"/>
     <w:qFormat/>
-    <w:rsid w:val="001C4CC1"/>
+    <w:rsid w:val="00C9137F"/>
     <w:pPr>
       <w:numPr>
         <w:ilvl w:val="1"/>
@@ -1197,7 +1169,7 @@
     <w:basedOn w:val="DefaultParagraphFont"/>
     <w:link w:val="Subtitle"/>
     <w:uiPriority w:val="11"/>
-    <w:rsid w:val="001C4CC1"/>
+    <w:rsid w:val="00C9137F"/>
     <w:rPr>
       <w:rFonts w:eastAsiaTheme="majorEastAsia" w:cstheme="majorBidi"/>
       <w:color w:val="595959" w:themeColor="text1" w:themeTint="A6"/>
@@ -1213,7 +1185,7 @@
     <w:link w:val="QuoteChar"/>
     <w:uiPriority w:val="29"/>
     <w:qFormat/>
-    <w:rsid w:val="001C4CC1"/>
+    <w:rsid w:val="00C9137F"/>
     <w:pPr>
       <w:spacing w:before="160"/>
     </w:pPr>
@@ -1228,7 +1200,7 @@
     <w:basedOn w:val="DefaultParagraphFont"/>
     <w:link w:val="Quote"/>
     <w:uiPriority w:val="29"/>
-    <w:rsid w:val="001C4CC1"/>
+    <w:rsid w:val="00C9137F"/>
     <w:rPr>
       <w:i/>
       <w:iCs/>
@@ -1240,7 +1212,7 @@
     <w:basedOn w:val="Normal"/>
     <w:uiPriority w:val="34"/>
     <w:qFormat/>
-    <w:rsid w:val="001C4CC1"/>
+    <w:rsid w:val="00C9137F"/>
     <w:pPr>
       <w:ind w:left="720"/>
       <w:contextualSpacing/>
@@ -1251,7 +1223,7 @@
     <w:basedOn w:val="DefaultParagraphFont"/>
     <w:uiPriority w:val="21"/>
     <w:qFormat/>
-    <w:rsid w:val="001C4CC1"/>
+    <w:rsid w:val="00C9137F"/>
     <w:rPr>
       <w:i/>
       <w:iCs/>
@@ -1265,7 +1237,7 @@
     <w:link w:val="IntenseQuoteChar"/>
     <w:uiPriority w:val="30"/>
     <w:qFormat/>
-    <w:rsid w:val="001C4CC1"/>
+    <w:rsid w:val="00C9137F"/>
     <w:pPr>
       <w:pBdr>
         <w:top w:val="single" w:sz="4" w:space="10" w:color="0F4761" w:themeColor="accent1" w:themeShade="BF"/>
@@ -1285,7 +1257,7 @@
     <w:basedOn w:val="DefaultParagraphFont"/>
     <w:link w:val="IntenseQuote"/>
     <w:uiPriority w:val="30"/>
-    <w:rsid w:val="001C4CC1"/>
+    <w:rsid w:val="00C9137F"/>
     <w:rPr>
       <w:i/>
       <w:iCs/>
@@ -1297,7 +1269,7 @@
     <w:basedOn w:val="DefaultParagraphFont"/>
     <w:uiPriority w:val="32"/>
     <w:qFormat/>
-    <w:rsid w:val="001C4CC1"/>
+    <w:rsid w:val="00C9137F"/>
     <w:rPr>
       <w:b/>
       <w:bCs/>

</xml_diff>

<commit_message>
Sampul qism: cetak jenis tugas dan nomor mahasiswa
@jenis tercetak di bawah judul dan @nim di bawah nama kalau diisi.
Kosong atau "-" = barisnya tidak ada, jadi naskah lama tetap jalan.
Yang wajib tetap @judul dan @nama.

Co-Authored-By: Claude Opus 5.5 <noreply@anthropic.com>
</commit_message>
<xml_diff>
--- a/mesin/sampul_qism.docx
+++ b/mesin/sampul_qism.docx
@@ -207,6 +207,28 @@
     </w:p>
     <w:p>
       <w:pPr>
+        <w:spacing w:before="240"/>
+        <w:rPr>
+          <w:b/>
+          <w:bCs/>
+          <w:sz w:val="36"/>
+          <w:szCs w:val="36"/>
+          <w:rtl/>
+        </w:rPr>
+      </w:pPr>
+      <w:r>
+        <w:rPr>
+          <w:b/>
+          <w:bCs/>
+          <w:sz w:val="36"/>
+          <w:szCs w:val="36"/>
+          <w:rtl/>
+        </w:rPr>
+        <w:t>نوع البحث</w:t>
+      </w:r>
+    </w:p>
+    <w:p>
+      <w:pPr>
         <w:spacing w:before="1080" w:line="540" w:lineRule="exact"/>
         <w:rPr>
           <w:b/>
@@ -309,6 +331,28 @@
           <w:rtl/>
         </w:rPr>
         <w:t>اسم الطالب</w:t>
+      </w:r>
+    </w:p>
+    <w:p>
+      <w:pPr>
+        <w:spacing w:line="540" w:lineRule="exact"/>
+        <w:rPr>
+          <w:b/>
+          <w:bCs/>
+          <w:sz w:val="42"/>
+          <w:szCs w:val="42"/>
+          <w:rtl/>
+        </w:rPr>
+      </w:pPr>
+      <w:r>
+        <w:rPr>
+          <w:b/>
+          <w:bCs/>
+          <w:sz w:val="42"/>
+          <w:szCs w:val="42"/>
+          <w:rtl/>
+        </w:rPr>
+        <w:t>الرقم الجامعي</w:t>
       </w:r>
     </w:p>
     <w:p>

</xml_diff>

<commit_message>
Sampul qism: cetak jenis tugas dan nomor mahasiswa (#61)
@jenis tercetak di bawah judul dan @nim di bawah nama kalau diisi.
Kosong atau "-" = barisnya tidak ada, jadi naskah lama tetap jalan.
Yang wajib tetap @judul dan @nama.

Co-authored-by: Claude Opus 5.5 <noreply@anthropic.com>
</commit_message>
<xml_diff>
--- a/mesin/sampul_qism.docx
+++ b/mesin/sampul_qism.docx
@@ -207,6 +207,28 @@
     </w:p>
     <w:p>
       <w:pPr>
+        <w:spacing w:before="240"/>
+        <w:rPr>
+          <w:b/>
+          <w:bCs/>
+          <w:sz w:val="36"/>
+          <w:szCs w:val="36"/>
+          <w:rtl/>
+        </w:rPr>
+      </w:pPr>
+      <w:r>
+        <w:rPr>
+          <w:b/>
+          <w:bCs/>
+          <w:sz w:val="36"/>
+          <w:szCs w:val="36"/>
+          <w:rtl/>
+        </w:rPr>
+        <w:t>نوع البحث</w:t>
+      </w:r>
+    </w:p>
+    <w:p>
+      <w:pPr>
         <w:spacing w:before="1080" w:line="540" w:lineRule="exact"/>
         <w:rPr>
           <w:b/>
@@ -309,6 +331,28 @@
           <w:rtl/>
         </w:rPr>
         <w:t>اسم الطالب</w:t>
+      </w:r>
+    </w:p>
+    <w:p>
+      <w:pPr>
+        <w:spacing w:line="540" w:lineRule="exact"/>
+        <w:rPr>
+          <w:b/>
+          <w:bCs/>
+          <w:sz w:val="42"/>
+          <w:szCs w:val="42"/>
+          <w:rtl/>
+        </w:rPr>
+      </w:pPr>
+      <w:r>
+        <w:rPr>
+          <w:b/>
+          <w:bCs/>
+          <w:sz w:val="42"/>
+          <w:szCs w:val="42"/>
+          <w:rtl/>
+        </w:rPr>
+        <w:t>الرقم الجامعي</w:t>
       </w:r>
     </w:p>
     <w:p>

</xml_diff>

<commit_message>
Sampul qism: nomor mahasiswa lebih kecil dari nama
Co-Authored-By: Claude Opus 5.5 <noreply@anthropic.com>
</commit_message>
<xml_diff>
--- a/mesin/sampul_qism.docx
+++ b/mesin/sampul_qism.docx
@@ -337,19 +337,15 @@
       <w:pPr>
         <w:spacing w:line="540" w:lineRule="exact"/>
         <w:rPr>
-          <w:b/>
-          <w:bCs/>
-          <w:sz w:val="42"/>
-          <w:szCs w:val="42"/>
+          <w:sz w:val="32"/>
+          <w:szCs w:val="32"/>
           <w:rtl/>
         </w:rPr>
       </w:pPr>
       <w:r>
         <w:rPr>
-          <w:b/>
-          <w:bCs/>
-          <w:sz w:val="42"/>
-          <w:szCs w:val="42"/>
+          <w:sz w:val="32"/>
+          <w:szCs w:val="32"/>
           <w:rtl/>
         </w:rPr>
         <w:t>الرقم الجامعي</w:t>

</xml_diff>

<commit_message>
Sampul qism: nomor mahasiswa lebih kecil dari nama (#62)
Co-authored-by: Claude Opus 5.5 <noreply@anthropic.com>
</commit_message>
<xml_diff>
--- a/mesin/sampul_qism.docx
+++ b/mesin/sampul_qism.docx
@@ -337,19 +337,15 @@
       <w:pPr>
         <w:spacing w:line="540" w:lineRule="exact"/>
         <w:rPr>
-          <w:b/>
-          <w:bCs/>
-          <w:sz w:val="42"/>
-          <w:szCs w:val="42"/>
+          <w:sz w:val="32"/>
+          <w:szCs w:val="32"/>
           <w:rtl/>
         </w:rPr>
       </w:pPr>
       <w:r>
         <w:rPr>
-          <w:b/>
-          <w:bCs/>
-          <w:sz w:val="42"/>
-          <w:szCs w:val="42"/>
+          <w:sz w:val="32"/>
+          <w:szCs w:val="32"/>
           <w:rtl/>
         </w:rPr>
         <w:t>الرقم الجامعي</w:t>

</xml_diff>